<commit_message>
docs(modelo-datos): document data json
- Add Data JSON/typed data section in data model doc\n- Regenerate documentation.md\n- Note change in TASKS
</commit_message>
<xml_diff>
--- a/Documentation Copy/eShopy_Documento_4_Modelo_de_Datos_v1.0.docx
+++ b/Documentation Copy/eShopy_Documento_4_Modelo_de_Datos_v1.0.docx
@@ -1,6 +1,6 @@
 
 <file path=word/document.xml><?xml version="1.0" encoding="utf-8"?>
-<w:document xmlns:wpc="http://schemas.microsoft.com/office/word/2010/wordprocessingCanvas" xmlns:mo="http://schemas.microsoft.com/office/mac/office/2008/main" xmlns:mc="http://schemas.openxmlformats.org/markup-compatibility/2006" xmlns:mv="urn:schemas-microsoft-com:mac:vml" xmlns:o="urn:schemas-microsoft-com:office:office" xmlns:r="http://schemas.openxmlformats.org/officeDocument/2006/relationships" xmlns:m="http://schemas.openxmlformats.org/officeDocument/2006/math" xmlns:v="urn:schemas-microsoft-com:vml" xmlns:wp14="http://schemas.microsoft.com/office/word/2010/wordprocessingDrawing" xmlns:wp="http://schemas.openxmlformats.org/drawingml/2006/wordprocessingDrawing" xmlns:w10="urn:schemas-microsoft-com:office:word" xmlns:w="http://schemas.openxmlformats.org/wordprocessingml/2006/main" xmlns:w14="http://schemas.microsoft.com/office/word/2010/wordml" xmlns:wpg="http://schemas.microsoft.com/office/word/2010/wordprocessingGroup" xmlns:wpi="http://schemas.microsoft.com/office/word/2010/wordprocessingInk" xmlns:wne="http://schemas.microsoft.com/office/word/2006/wordml" xmlns:wps="http://schemas.microsoft.com/office/word/2010/wordprocessingShape" mc:Ignorable="w14 wp14">
+<w:document xmlns:ns1="http://schemas.openxmlformats.org/markup-compatibility/2006" xmlns:w="http://schemas.openxmlformats.org/wordprocessingml/2006/main" ns1:Ignorable="w14 wp14">
   <w:body>
     <w:p>
       <w:pPr>
@@ -97,6 +97,26 @@
     <w:p>
       <w:r>
         <w:t>1.3 Columnas base (AppEntity)</w:t>
+      </w:r>
+    </w:p>
+    <w:p>
+      <w:r>
+        <w:t>1.4 Data JSON / Typed Data</w:t>
+      </w:r>
+    </w:p>
+    <w:p>
+      <w:r>
+        <w:t>- La columna Data almacena JSON para extensiones no criticas.</w:t>
+      </w:r>
+    </w:p>
+    <w:p>
+      <w:r>
+        <w:t>- El acceso debe ser tipado (ej. ProductData) usando helpers GetData/SetData.</w:t>
+      </w:r>
+    </w:p>
+    <w:p>
+      <w:r>
+        <w:t>- No exponer Data directamente en API salvo casos justificados.</w:t>
       </w:r>
     </w:p>
     <w:p>
@@ -1950,7 +1970,8 @@
     </w:p>
     <w:p>
       <w:r>
-        <w:t>- Usar RowVersion como token de concurrencia (IsRowVersion).</w:t>
+        <w:t>- Usar RowVersion como token de concurrencia (IsRowVersion).
+- En el mapping EF, agregar HasComment en todas las columnas.</w:t>
       </w:r>
     </w:p>
     <w:p>

</xml_diff>